<commit_message>
Refactor route handlers into Blueprints, modularize case workspace templates, update E2E tests, and set up engineering policies
</commit_message>
<xml_diff>
--- a/templates/PIRAMAL/RM_PIRAMAL_2B_1L.docx
+++ b/templates/PIRAMAL/RM_PIRAMAL_2B_1L.docx
@@ -3426,15 +3426,25 @@
                 <w:sz w:val="24"/>
                 <w:szCs w:val="24"/>
               </w:rPr>
-              <w:t>{{ls[0].a}}</w:t>
-            </w:r>
-            <w:r>
-              <w:rPr>
-                <w:rFonts w:asciiTheme="majorHAnsi" w:hAnsiTheme="majorHAnsi"/>
-                <w:sz w:val="24"/>
-                <w:szCs w:val="24"/>
-              </w:rPr>
-              <w:t>/-</w:t>
+              <w:t>{{</w:t>
+            </w:r>
+            <w:proofErr w:type="spellStart"/>
+            <w:r>
+              <w:rPr>
+                <w:rFonts w:asciiTheme="majorHAnsi" w:hAnsiTheme="majorHAnsi"/>
+                <w:sz w:val="24"/>
+                <w:szCs w:val="24"/>
+              </w:rPr>
+              <w:t>ls</w:t>
+            </w:r>
+            <w:proofErr w:type="spellEnd"/>
+            <w:r>
+              <w:rPr>
+                <w:rFonts w:asciiTheme="majorHAnsi" w:hAnsiTheme="majorHAnsi"/>
+                <w:sz w:val="24"/>
+                <w:szCs w:val="24"/>
+              </w:rPr>
+              <w:t>[0].a}}</w:t>
             </w:r>
           </w:p>
         </w:tc>
@@ -4701,8 +4711,6 @@
           <w:u w:val="none"/>
         </w:rPr>
       </w:pPr>
-      <w:bookmarkStart w:id="0" w:name="_GoBack"/>
-      <w:bookmarkEnd w:id="0"/>
       <w:r>
         <w:rPr>
           <w:rFonts w:asciiTheme="majorHAnsi" w:hAnsiTheme="majorHAnsi"/>
@@ -4858,120 +4866,6 @@
         <w:rPr>
           <w:rFonts w:asciiTheme="majorHAnsi" w:hAnsiTheme="majorHAnsi"/>
           <w:b/>
-        </w:rPr>
-      </w:pPr>
-    </w:p>
-    <w:p>
-      <w:pPr>
-        <w:pStyle w:val="ListParagraph"/>
-        <w:numPr>
-          <w:ilvl w:val="1"/>
-          <w:numId w:val="1"/>
-        </w:numPr>
-        <w:tabs>
-          <w:tab w:val="left" w:pos="1008"/>
-        </w:tabs>
-        <w:ind w:right="464"/>
-        <w:rPr>
-          <w:rFonts w:asciiTheme="majorHAnsi" w:hAnsiTheme="majorHAnsi"/>
-          <w:sz w:val="24"/>
-          <w:szCs w:val="24"/>
-        </w:rPr>
-      </w:pPr>
-      <w:r>
-        <w:rPr>
-          <w:rFonts w:asciiTheme="majorHAnsi" w:hAnsiTheme="majorHAnsi"/>
-          <w:sz w:val="24"/>
-          <w:szCs w:val="24"/>
-        </w:rPr>
-        <w:t>{{ds[0].t}}</w:t>
-      </w:r>
-    </w:p>
-    <w:p>
-      <w:pPr>
-        <w:pStyle w:val="BodyText"/>
-        <w:spacing w:before="2"/>
-        <w:rPr>
-          <w:rFonts w:asciiTheme="majorHAnsi" w:hAnsiTheme="majorHAnsi"/>
-          <w:highlight w:val="yellow"/>
-        </w:rPr>
-      </w:pPr>
-    </w:p>
-    <w:p>
-      <w:pPr>
-        <w:pStyle w:val="ListParagraph"/>
-        <w:numPr>
-          <w:ilvl w:val="1"/>
-          <w:numId w:val="1"/>
-        </w:numPr>
-        <w:tabs>
-          <w:tab w:val="left" w:pos="1008"/>
-        </w:tabs>
-        <w:spacing w:line="237" w:lineRule="auto"/>
-        <w:ind w:right="465"/>
-        <w:rPr>
-          <w:rFonts w:asciiTheme="majorHAnsi" w:hAnsiTheme="majorHAnsi"/>
-          <w:sz w:val="24"/>
-          <w:szCs w:val="24"/>
-        </w:rPr>
-      </w:pPr>
-      <w:r>
-        <w:rPr>
-          <w:rFonts w:asciiTheme="majorHAnsi" w:hAnsiTheme="majorHAnsi"/>
-          <w:sz w:val="24"/>
-          <w:szCs w:val="24"/>
-        </w:rPr>
-        <w:t>{{ds[1].t}}</w:t>
-      </w:r>
-    </w:p>
-    <w:p>
-      <w:pPr>
-        <w:pStyle w:val="ListParagraph"/>
-        <w:rPr>
-          <w:rFonts w:asciiTheme="majorHAnsi" w:hAnsiTheme="majorHAnsi"/>
-          <w:b/>
-          <w:bCs/>
-          <w:sz w:val="24"/>
-          <w:szCs w:val="24"/>
-        </w:rPr>
-      </w:pPr>
-    </w:p>
-    <w:p>
-      <w:pPr>
-        <w:pStyle w:val="ListParagraph"/>
-        <w:numPr>
-          <w:ilvl w:val="1"/>
-          <w:numId w:val="1"/>
-        </w:numPr>
-        <w:tabs>
-          <w:tab w:val="left" w:pos="1008"/>
-        </w:tabs>
-        <w:spacing w:line="237" w:lineRule="auto"/>
-        <w:ind w:right="465"/>
-        <w:rPr>
-          <w:rFonts w:asciiTheme="majorHAnsi" w:hAnsiTheme="majorHAnsi"/>
-          <w:sz w:val="24"/>
-          <w:szCs w:val="24"/>
-        </w:rPr>
-      </w:pPr>
-      <w:r>
-        <w:rPr>
-          <w:rFonts w:asciiTheme="majorHAnsi" w:hAnsiTheme="majorHAnsi"/>
-          <w:sz w:val="24"/>
-          <w:szCs w:val="24"/>
-        </w:rPr>
-        <w:t>{{ds[2].t}}</w:t>
-      </w:r>
-    </w:p>
-    <w:p>
-      <w:pPr>
-        <w:pStyle w:val="ListParagraph"/>
-        <w:rPr>
-          <w:rFonts w:asciiTheme="majorHAnsi" w:hAnsiTheme="majorHAnsi"/>
-          <w:b/>
-          <w:bCs/>
-          <w:sz w:val="24"/>
-          <w:szCs w:val="24"/>
         </w:rPr>
       </w:pPr>
     </w:p>
@@ -4996,8 +4890,10 @@
           <w:sz w:val="24"/>
           <w:szCs w:val="24"/>
         </w:rPr>
-        <w:t>{{ds[3].t}}</w:t>
-      </w:r>
+        <w:t>{{chain_text}}</w:t>
+      </w:r>
+      <w:bookmarkStart w:id="0" w:name="_GoBack"/>
+      <w:bookmarkEnd w:id="0"/>
     </w:p>
     <w:p>
       <w:pPr>
@@ -5571,129 +5467,55 @@
           <w:rFonts w:asciiTheme="majorHAnsi" w:hAnsiTheme="majorHAnsi"/>
           <w:b/>
         </w:rPr>
-        <w:t>Mortgagee, by the hands of {{bsign.s}} {{bsign.n}} its authorised official.</w:t>
-      </w:r>
-      <w:r>
-        <w:rPr>
-          <w:rFonts w:asciiTheme="majorHAnsi" w:hAnsiTheme="majorHAnsi"/>
-        </w:rPr>
-      </w:r>
-      <w:r>
-        <w:rPr>
-          <w:rFonts w:asciiTheme="majorHAnsi" w:hAnsiTheme="majorHAnsi"/>
-          <w:spacing w:val="-8"/>
-        </w:rPr>
-      </w:r>
-      <w:r>
-        <w:rPr>
-          <w:rFonts w:asciiTheme="majorHAnsi" w:hAnsiTheme="majorHAnsi"/>
-        </w:rPr>
-      </w:r>
-      <w:r>
-        <w:rPr>
-          <w:rFonts w:asciiTheme="majorHAnsi" w:hAnsiTheme="majorHAnsi"/>
-          <w:spacing w:val="-4"/>
-        </w:rPr>
-      </w:r>
-      <w:r>
-        <w:rPr>
-          <w:rFonts w:asciiTheme="majorHAnsi" w:hAnsiTheme="majorHAnsi"/>
-        </w:rPr>
-      </w:r>
-      <w:r>
-        <w:rPr>
-          <w:rFonts w:asciiTheme="majorHAnsi" w:hAnsiTheme="majorHAnsi"/>
-          <w:spacing w:val="-2"/>
-        </w:rPr>
-      </w:r>
-      <w:r>
-        <w:rPr>
-          <w:rFonts w:asciiTheme="majorHAnsi" w:hAnsiTheme="majorHAnsi"/>
-        </w:rPr>
-      </w:r>
-      <w:r>
-        <w:rPr>
-          <w:rFonts w:asciiTheme="majorHAnsi" w:hAnsiTheme="majorHAnsi"/>
-          <w:spacing w:val="-3"/>
-        </w:rPr>
-      </w:r>
-      <w:r>
-        <w:rPr>
-          <w:rFonts w:asciiTheme="majorHAnsi" w:hAnsiTheme="majorHAnsi"/>
-        </w:rPr>
-      </w:r>
-      <w:r>
-        <w:rPr>
-          <w:rFonts w:asciiTheme="majorHAnsi" w:hAnsiTheme="majorHAnsi"/>
-          <w:spacing w:val="-2"/>
-        </w:rPr>
-      </w:r>
+        <w:t>Mortgagee, by the hands of {{bsign.s}} {{</w:t>
+      </w:r>
+      <w:proofErr w:type="spellStart"/>
       <w:r>
         <w:rPr>
           <w:rFonts w:asciiTheme="majorHAnsi" w:hAnsiTheme="majorHAnsi"/>
           <w:b/>
-          <w:color w:val="000000"/>
-        </w:rPr>
+        </w:rPr>
+        <w:t>bsign.n</w:t>
+      </w:r>
+      <w:proofErr w:type="spellEnd"/>
+      <w:r>
+        <w:rPr>
+          <w:rFonts w:asciiTheme="majorHAnsi" w:hAnsiTheme="majorHAnsi"/>
+          <w:b/>
+        </w:rPr>
+        <w:t xml:space="preserve">}} </w:t>
+      </w:r>
+      <w:proofErr w:type="gramStart"/>
+      <w:r>
+        <w:rPr>
+          <w:rFonts w:asciiTheme="majorHAnsi" w:hAnsiTheme="majorHAnsi"/>
+          <w:b/>
+        </w:rPr>
+        <w:t>its</w:t>
+      </w:r>
+      <w:proofErr w:type="gramEnd"/>
+      <w:r>
+        <w:rPr>
+          <w:rFonts w:asciiTheme="majorHAnsi" w:hAnsiTheme="majorHAnsi"/>
+          <w:b/>
+        </w:rPr>
+        <w:t xml:space="preserve"> </w:t>
       </w:r>
       <w:proofErr w:type="spellStart"/>
       <w:r>
         <w:rPr>
           <w:rFonts w:asciiTheme="majorHAnsi" w:hAnsiTheme="majorHAnsi"/>
           <w:b/>
-          <w:color w:val="000000"/>
-        </w:rPr>
+        </w:rPr>
+        <w:t>authorised</w:t>
       </w:r>
       <w:proofErr w:type="spellEnd"/>
       <w:r>
         <w:rPr>
           <w:rFonts w:asciiTheme="majorHAnsi" w:hAnsiTheme="majorHAnsi"/>
           <w:b/>
-          <w:color w:val="000000"/>
-        </w:rPr>
-      </w:r>
-      <w:r>
-        <w:rPr>
-          <w:rFonts w:asciiTheme="majorHAnsi" w:hAnsiTheme="majorHAnsi"/>
-          <w:color w:val="000000"/>
-          <w:spacing w:val="-13"/>
-        </w:rPr>
-      </w:r>
-      <w:proofErr w:type="gramStart"/>
-      <w:r>
-        <w:rPr>
-          <w:rFonts w:asciiTheme="majorHAnsi" w:hAnsiTheme="majorHAnsi"/>
-          <w:color w:val="000000"/>
-        </w:rPr>
-      </w:r>
-      <w:proofErr w:type="gramEnd"/>
-      <w:r>
-        <w:rPr>
-          <w:rFonts w:asciiTheme="majorHAnsi" w:hAnsiTheme="majorHAnsi"/>
-          <w:color w:val="000000"/>
-          <w:spacing w:val="-14"/>
-        </w:rPr>
-      </w:r>
-      <w:proofErr w:type="spellStart"/>
-      <w:r>
-        <w:rPr>
-          <w:rFonts w:asciiTheme="majorHAnsi" w:hAnsiTheme="majorHAnsi"/>
-          <w:color w:val="000000"/>
-        </w:rPr>
-      </w:r>
-      <w:proofErr w:type="spellEnd"/>
-      <w:r>
-        <w:rPr>
-          <w:rFonts w:asciiTheme="majorHAnsi" w:hAnsiTheme="majorHAnsi"/>
-          <w:color w:val="000000"/>
-          <w:spacing w:val="-12"/>
-        </w:rPr>
-      </w:r>
-      <w:r>
-        <w:rPr>
-          <w:rFonts w:asciiTheme="majorHAnsi" w:hAnsiTheme="majorHAnsi"/>
-          <w:color w:val="000000"/>
-          <w:spacing w:val="-2"/>
-        </w:rPr>
+        </w:rPr>
+        <w:t xml:space="preserve"> official.</w:t>
       </w:r>
     </w:p>
     <w:p>

</xml_diff>